<commit_message>
KUT: one sheet-banding proposal - follow the NCS order the site convention uses
kut_naming.SHEET_BANDS put 3D in band 8 and reserved 9; the site convention
and the US National CAD Standard put 3D in 9. Two proposals were in
circulation. The pack now follows NCS (still to be confirmed at kickoff), and
the gate compares the 3D band across the pack and both hand-edited tables.

Co-Authored-By: Claude Opus 5.5 <noreply@anthropic.com>
</commit_message>
<xml_diff>
--- a/KUT_DOCS_WORKING/issued/KUT_Document_Control_Standard.docx
+++ b/KUT_DOCS_WORKING/issued/KUT_Document_Control_Standard.docx
@@ -5940,7 +5940,7 @@
                 <w:b w:val="0"/>
                 <w:sz w:val="17"/>
               </w:rPr>
-              <w:t>Schedules</w:t>
+              <w:t>Schedules and diagrams</w:t>
             </w:r>
           </w:p>
         </w:tc>
@@ -5986,7 +5986,7 @@
                 <w:b w:val="0"/>
                 <w:sz w:val="17"/>
               </w:rPr>
-              <w:t>Diagrams and schematics — single line, riser, system</w:t>
+              <w:t>User-defined: schematics — single line, riser, system</w:t>
             </w:r>
           </w:p>
         </w:tc>
@@ -6032,7 +6032,7 @@
                 <w:b w:val="0"/>
                 <w:sz w:val="17"/>
               </w:rPr>
-              <w:t>Three-dimensional views and presentation</w:t>
+              <w:t>User-defined: reserved — coordination, sketches, mark-ups</w:t>
             </w:r>
           </w:p>
         </w:tc>
@@ -6078,7 +6078,7 @@
                 <w:b w:val="0"/>
                 <w:sz w:val="17"/>
               </w:rPr>
-              <w:t>Reserved</w:t>
+              <w:t>Three-dimensional views — isometrics, axonometrics, perspectives, presentation</w:t>
             </w:r>
           </w:p>
         </w:tc>

</xml_diff>